<commit_message>
trying to generate real report
</commit_message>
<xml_diff>
--- a/exemples/template_final.docx
+++ b/exemples/template_final.docx
@@ -88,7 +88,7 @@
           <w:szCs w:val="24"/>
         </w:rPr>
         <w:drawing>
-          <wp:anchor distT="0" distB="0" distL="114300" distR="114300" simplePos="0" relativeHeight="251663360" behindDoc="0" locked="0" layoutInCell="1" allowOverlap="1" wp14:anchorId="2EE99A91" wp14:editId="708F0F5D">
+          <wp:anchor distT="0" distB="0" distL="114300" distR="114300" simplePos="0" relativeHeight="251663360" behindDoc="0" locked="0" layoutInCell="1" allowOverlap="1" wp14:anchorId="2EE99A91" wp14:editId="7A14A32D">
             <wp:simplePos x="0" y="0"/>
             <wp:positionH relativeFrom="margin">
               <wp:align>left</wp:align>
@@ -271,7 +271,27 @@
           <w:color w:val="2F5496" w:themeColor="accent1" w:themeShade="BF"/>
           <w:sz w:val="20"/>
         </w:rPr>
-        <w:t>NOVOCIB {{numéro_rapport}}</w:t>
+        <w:t>NOVOCIB {{</w:t>
+      </w:r>
+      <w:proofErr w:type="spellStart"/>
+      <w:r>
+        <w:rPr>
+          <w:rFonts w:asciiTheme="minorHAnsi" w:hAnsiTheme="minorHAnsi" w:cstheme="minorHAnsi"/>
+          <w:b/>
+          <w:color w:val="2F5496" w:themeColor="accent1" w:themeShade="BF"/>
+          <w:sz w:val="20"/>
+        </w:rPr>
+        <w:t>numéro_rapport</w:t>
+      </w:r>
+      <w:proofErr w:type="spellEnd"/>
+      <w:r>
+        <w:rPr>
+          <w:rFonts w:asciiTheme="minorHAnsi" w:hAnsiTheme="minorHAnsi" w:cstheme="minorHAnsi"/>
+          <w:b/>
+          <w:color w:val="2F5496" w:themeColor="accent1" w:themeShade="BF"/>
+          <w:sz w:val="20"/>
+        </w:rPr>
+        <w:t>}}</w:t>
       </w:r>
     </w:p>
     <w:p>
@@ -307,7 +327,25 @@
           <w:bCs/>
           <w:sz w:val="20"/>
         </w:rPr>
-        <w:t>du {{date_rapport}}</w:t>
+        <w:t>du {{</w:t>
+      </w:r>
+      <w:proofErr w:type="spellStart"/>
+      <w:r>
+        <w:rPr>
+          <w:rFonts w:asciiTheme="minorHAnsi" w:hAnsiTheme="minorHAnsi" w:cstheme="minorHAnsi"/>
+          <w:bCs/>
+          <w:sz w:val="20"/>
+        </w:rPr>
+        <w:t>date_rapport</w:t>
+      </w:r>
+      <w:proofErr w:type="spellEnd"/>
+      <w:r>
+        <w:rPr>
+          <w:rFonts w:asciiTheme="minorHAnsi" w:hAnsiTheme="minorHAnsi" w:cstheme="minorHAnsi"/>
+          <w:bCs/>
+          <w:sz w:val="20"/>
+        </w:rPr>
+        <w:t>}}</w:t>
       </w:r>
     </w:p>
     <w:p>
@@ -325,7 +363,25 @@
           <w:b/>
           <w:sz w:val="20"/>
         </w:rPr>
-        <w:t>{{appellation_produit}}</w:t>
+        <w:t>{{</w:t>
+      </w:r>
+      <w:proofErr w:type="spellStart"/>
+      <w:r>
+        <w:rPr>
+          <w:rFonts w:asciiTheme="minorHAnsi" w:hAnsiTheme="minorHAnsi" w:cstheme="minorHAnsi"/>
+          <w:b/>
+          <w:sz w:val="20"/>
+        </w:rPr>
+        <w:t>appellation_produit</w:t>
+      </w:r>
+      <w:proofErr w:type="spellEnd"/>
+      <w:r>
+        <w:rPr>
+          <w:rFonts w:asciiTheme="minorHAnsi" w:hAnsiTheme="minorHAnsi" w:cstheme="minorHAnsi"/>
+          <w:b/>
+          <w:sz w:val="20"/>
+        </w:rPr>
+        <w:t>}}</w:t>
       </w:r>
     </w:p>
     <w:p>
@@ -344,7 +400,6 @@
           <w:b/>
           <w:bCs/>
           <w:sz w:val="20"/>
-          <w:highlight w:val="yellow"/>
         </w:rPr>
       </w:pPr>
       <w:r>
@@ -353,9 +408,28 @@
           <w:b/>
           <w:bCs/>
           <w:sz w:val="20"/>
-          <w:highlight w:val="yellow"/>
-        </w:rPr>
-        <w:t>{{nom_entreprise_client}}</w:t>
+        </w:rPr>
+        <w:t>{{</w:t>
+      </w:r>
+      <w:proofErr w:type="spellStart"/>
+      <w:r>
+        <w:rPr>
+          <w:rFonts w:asciiTheme="minorHAnsi" w:hAnsiTheme="minorHAnsi" w:cstheme="minorHAnsi"/>
+          <w:b/>
+          <w:bCs/>
+          <w:sz w:val="20"/>
+        </w:rPr>
+        <w:t>nom_entreprise_client</w:t>
+      </w:r>
+      <w:proofErr w:type="spellEnd"/>
+      <w:r>
+        <w:rPr>
+          <w:rFonts w:asciiTheme="minorHAnsi" w:hAnsiTheme="minorHAnsi" w:cstheme="minorHAnsi"/>
+          <w:b/>
+          <w:bCs/>
+          <w:sz w:val="20"/>
+        </w:rPr>
+        <w:t>}}</w:t>
       </w:r>
     </w:p>
     <w:p>
@@ -372,16 +446,30 @@
         <w:rPr>
           <w:rFonts w:asciiTheme="minorHAnsi" w:hAnsiTheme="minorHAnsi" w:cstheme="minorHAnsi"/>
           <w:sz w:val="20"/>
-          <w:highlight w:val="yellow"/>
         </w:rPr>
       </w:pPr>
       <w:r>
         <w:rPr>
           <w:rFonts w:asciiTheme="minorHAnsi" w:hAnsiTheme="minorHAnsi" w:cstheme="minorHAnsi"/>
           <w:sz w:val="20"/>
-          <w:highlight w:val="yellow"/>
-        </w:rPr>
-        <w:t>{{adresse_entreprise_client}}</w:t>
+        </w:rPr>
+        <w:t>{{</w:t>
+      </w:r>
+      <w:proofErr w:type="spellStart"/>
+      <w:r>
+        <w:rPr>
+          <w:rFonts w:asciiTheme="minorHAnsi" w:hAnsiTheme="minorHAnsi" w:cstheme="minorHAnsi"/>
+          <w:sz w:val="20"/>
+        </w:rPr>
+        <w:t>adresse_entreprise_client</w:t>
+      </w:r>
+      <w:proofErr w:type="spellEnd"/>
+      <w:r>
+        <w:rPr>
+          <w:rFonts w:asciiTheme="minorHAnsi" w:hAnsiTheme="minorHAnsi" w:cstheme="minorHAnsi"/>
+          <w:sz w:val="20"/>
+        </w:rPr>
+        <w:t>}}</w:t>
       </w:r>
     </w:p>
     <w:p>
@@ -400,7 +488,6 @@
           <w:i/>
           <w:iCs/>
           <w:sz w:val="20"/>
-          <w:highlight w:val="yellow"/>
         </w:rPr>
       </w:pPr>
       <w:r>
@@ -411,7 +498,6 @@
           <w:i/>
           <w:iCs/>
           <w:sz w:val="20"/>
-          <w:highlight w:val="yellow"/>
         </w:rPr>
         <w:t xml:space="preserve"> </w:t>
       </w:r>
@@ -421,9 +507,28 @@
           <w:i/>
           <w:iCs/>
           <w:sz w:val="20"/>
-          <w:highlight w:val="yellow"/>
-        </w:rPr>
-        <w:t>A l'attention de {{nom_destinataire}}</w:t>
+        </w:rPr>
+        <w:t>A l'attention de {{</w:t>
+      </w:r>
+      <w:proofErr w:type="spellStart"/>
+      <w:r>
+        <w:rPr>
+          <w:rFonts w:asciiTheme="minorHAnsi" w:hAnsiTheme="minorHAnsi" w:cstheme="minorHAnsi"/>
+          <w:i/>
+          <w:iCs/>
+          <w:sz w:val="20"/>
+        </w:rPr>
+        <w:t>nom_destinataire</w:t>
+      </w:r>
+      <w:proofErr w:type="spellEnd"/>
+      <w:r>
+        <w:rPr>
+          <w:rFonts w:asciiTheme="minorHAnsi" w:hAnsiTheme="minorHAnsi" w:cstheme="minorHAnsi"/>
+          <w:i/>
+          <w:iCs/>
+          <w:sz w:val="20"/>
+        </w:rPr>
+        <w:t>}}</w:t>
       </w:r>
     </w:p>
     <w:p>
@@ -451,7 +556,27 @@
           <w:iCs/>
           <w:sz w:val="20"/>
         </w:rPr>
-        <w:t xml:space="preserve">{{titre_poste_destinataire}}  </w:t>
+        <w:t>{{</w:t>
+      </w:r>
+      <w:proofErr w:type="spellStart"/>
+      <w:r>
+        <w:rPr>
+          <w:rFonts w:asciiTheme="minorHAnsi" w:hAnsiTheme="minorHAnsi" w:cstheme="minorHAnsi"/>
+          <w:i/>
+          <w:iCs/>
+          <w:sz w:val="20"/>
+        </w:rPr>
+        <w:t>titre_poste_destinataire</w:t>
+      </w:r>
+      <w:proofErr w:type="spellEnd"/>
+      <w:r>
+        <w:rPr>
+          <w:rFonts w:asciiTheme="minorHAnsi" w:hAnsiTheme="minorHAnsi" w:cstheme="minorHAnsi"/>
+          <w:i/>
+          <w:iCs/>
+          <w:sz w:val="20"/>
+        </w:rPr>
+        <w:t xml:space="preserve">}}  </w:t>
       </w:r>
     </w:p>
     <w:tbl>
@@ -554,9 +679,37 @@
                 <w:b/>
                 <w:bCs/>
                 <w:color w:val="2F5496" w:themeColor="accent1" w:themeShade="BF"/>
-                <w:highlight w:val="yellow"/>
-              </w:rPr>
-            </w:pPr>
+              </w:rPr>
+            </w:pPr>
+            <w:r>
+              <w:rPr>
+                <w:rFonts w:asciiTheme="minorHAnsi" w:hAnsiTheme="minorHAnsi" w:cstheme="minorHAnsi"/>
+                <w:b/>
+                <w:bCs/>
+                <w:color w:val="2F5496" w:themeColor="accent1" w:themeShade="BF"/>
+              </w:rPr>
+              <w:t>{{</w:t>
+            </w:r>
+            <w:proofErr w:type="spellStart"/>
+            <w:r>
+              <w:rPr>
+                <w:rFonts w:asciiTheme="minorHAnsi" w:hAnsiTheme="minorHAnsi" w:cstheme="minorHAnsi"/>
+                <w:b/>
+                <w:bCs/>
+                <w:color w:val="2F5496" w:themeColor="accent1" w:themeShade="BF"/>
+              </w:rPr>
+              <w:t>Lieu_de_prelevment</w:t>
+            </w:r>
+            <w:proofErr w:type="spellEnd"/>
+            <w:r>
+              <w:rPr>
+                <w:rFonts w:asciiTheme="minorHAnsi" w:hAnsiTheme="minorHAnsi" w:cstheme="minorHAnsi"/>
+                <w:b/>
+                <w:bCs/>
+                <w:color w:val="2F5496" w:themeColor="accent1" w:themeShade="BF"/>
+              </w:rPr>
+              <w:t>}}</w:t>
+            </w:r>
             <w:r>
               <w:rPr>
                 <w:rFonts w:asciiTheme="minorHAnsi" w:hAnsiTheme="minorHAnsi" w:cstheme="minorHAnsi"/>
@@ -572,9 +725,28 @@
                 <w:b/>
                 <w:bCs/>
                 <w:color w:val="2F5496" w:themeColor="accent1" w:themeShade="BF"/>
-                <w:highlight w:val="yellow"/>
-              </w:rPr>
-              <w:t xml:space="preserve">Comptoir Océanique 04/06/2026 12h 10 Rue de Marengo,  </w:t>
+              </w:rPr>
+              <w:t>{{</w:t>
+            </w:r>
+            <w:proofErr w:type="spellStart"/>
+            <w:r>
+              <w:rPr>
+                <w:rFonts w:asciiTheme="minorHAnsi" w:hAnsiTheme="minorHAnsi" w:cstheme="minorHAnsi"/>
+                <w:b/>
+                <w:bCs/>
+                <w:color w:val="2F5496" w:themeColor="accent1" w:themeShade="BF"/>
+              </w:rPr>
+              <w:t>date_heure_prelevment</w:t>
+            </w:r>
+            <w:proofErr w:type="spellEnd"/>
+            <w:r>
+              <w:rPr>
+                <w:rFonts w:asciiTheme="minorHAnsi" w:hAnsiTheme="minorHAnsi" w:cstheme="minorHAnsi"/>
+                <w:b/>
+                <w:bCs/>
+                <w:color w:val="2F5496" w:themeColor="accent1" w:themeShade="BF"/>
+              </w:rPr>
+              <w:t>}}</w:t>
             </w:r>
           </w:p>
           <w:p>
@@ -595,9 +767,70 @@
                 <w:b/>
                 <w:bCs/>
                 <w:color w:val="2F5496" w:themeColor="accent1" w:themeShade="BF"/>
-                <w:highlight w:val="yellow"/>
-              </w:rPr>
-              <w:t>Boulogne-sur-Mer</w:t>
+              </w:rPr>
+              <w:t>{{</w:t>
+            </w:r>
+            <w:proofErr w:type="spellStart"/>
+            <w:r>
+              <w:rPr>
+                <w:rFonts w:asciiTheme="minorHAnsi" w:hAnsiTheme="minorHAnsi" w:cstheme="minorHAnsi"/>
+                <w:b/>
+                <w:bCs/>
+                <w:color w:val="2F5496" w:themeColor="accent1" w:themeShade="BF"/>
+              </w:rPr>
+              <w:t>adresse_prelevement</w:t>
+            </w:r>
+            <w:proofErr w:type="spellEnd"/>
+            <w:r>
+              <w:rPr>
+                <w:rFonts w:asciiTheme="minorHAnsi" w:hAnsiTheme="minorHAnsi" w:cstheme="minorHAnsi"/>
+                <w:b/>
+                <w:bCs/>
+                <w:color w:val="2F5496" w:themeColor="accent1" w:themeShade="BF"/>
+              </w:rPr>
+              <w:t>}}</w:t>
+            </w:r>
+          </w:p>
+          <w:p>
+            <w:pPr>
+              <w:spacing w:after="0" w:line="259" w:lineRule="auto"/>
+              <w:ind w:left="0" w:right="264" w:firstLine="0"/>
+              <w:jc w:val="left"/>
+              <w:rPr>
+                <w:rFonts w:asciiTheme="minorHAnsi" w:hAnsiTheme="minorHAnsi" w:cstheme="minorHAnsi"/>
+                <w:b/>
+                <w:bCs/>
+                <w:color w:val="2F5496" w:themeColor="accent1" w:themeShade="BF"/>
+              </w:rPr>
+            </w:pPr>
+            <w:r>
+              <w:rPr>
+                <w:rFonts w:asciiTheme="minorHAnsi" w:hAnsiTheme="minorHAnsi" w:cstheme="minorHAnsi"/>
+                <w:b/>
+                <w:bCs/>
+                <w:color w:val="2F5496" w:themeColor="accent1" w:themeShade="BF"/>
+              </w:rPr>
+              <w:t>{{</w:t>
+            </w:r>
+            <w:proofErr w:type="spellStart"/>
+            <w:r>
+              <w:rPr>
+                <w:rFonts w:asciiTheme="minorHAnsi" w:hAnsiTheme="minorHAnsi" w:cstheme="minorHAnsi"/>
+                <w:b/>
+                <w:bCs/>
+                <w:color w:val="2F5496" w:themeColor="accent1" w:themeShade="BF"/>
+              </w:rPr>
+              <w:t>ville_prelevement</w:t>
+            </w:r>
+            <w:proofErr w:type="spellEnd"/>
+            <w:r>
+              <w:rPr>
+                <w:rFonts w:asciiTheme="minorHAnsi" w:hAnsiTheme="minorHAnsi" w:cstheme="minorHAnsi"/>
+                <w:b/>
+                <w:bCs/>
+                <w:color w:val="2F5496" w:themeColor="accent1" w:themeShade="BF"/>
+              </w:rPr>
+              <w:t>}}</w:t>
             </w:r>
           </w:p>
         </w:tc>
@@ -661,7 +894,27 @@
                 <w:bCs/>
                 <w:color w:val="2F5496" w:themeColor="accent1" w:themeShade="BF"/>
               </w:rPr>
-              <w:t xml:space="preserve"> </w:t>
+              <w:t xml:space="preserve"> {{</w:t>
+            </w:r>
+            <w:proofErr w:type="spellStart"/>
+            <w:r>
+              <w:rPr>
+                <w:rFonts w:asciiTheme="minorHAnsi" w:hAnsiTheme="minorHAnsi" w:cstheme="minorHAnsi"/>
+                <w:b/>
+                <w:bCs/>
+                <w:color w:val="2F5496" w:themeColor="accent1" w:themeShade="BF"/>
+              </w:rPr>
+              <w:t>conditions_coservation_reception</w:t>
+            </w:r>
+            <w:proofErr w:type="spellEnd"/>
+            <w:r>
+              <w:rPr>
+                <w:rFonts w:asciiTheme="minorHAnsi" w:hAnsiTheme="minorHAnsi" w:cstheme="minorHAnsi"/>
+                <w:b/>
+                <w:bCs/>
+                <w:color w:val="2F5496" w:themeColor="accent1" w:themeShade="BF"/>
+              </w:rPr>
+              <w:t>}}</w:t>
             </w:r>
           </w:p>
         </w:tc>
@@ -697,7 +950,25 @@
                 <w:b/>
                 <w:bCs/>
               </w:rPr>
-              <w:t>Date, heure et T°C à la réception  au laboratoire:</w:t>
+              <w:t xml:space="preserve">Date, heure et T°C à la </w:t>
+            </w:r>
+            <w:proofErr w:type="gramStart"/>
+            <w:r>
+              <w:rPr>
+                <w:rFonts w:asciiTheme="minorHAnsi" w:hAnsiTheme="minorHAnsi" w:cstheme="minorHAnsi"/>
+                <w:b/>
+                <w:bCs/>
+              </w:rPr>
+              <w:t>réception  au</w:t>
+            </w:r>
+            <w:proofErr w:type="gramEnd"/>
+            <w:r>
+              <w:rPr>
+                <w:rFonts w:asciiTheme="minorHAnsi" w:hAnsiTheme="minorHAnsi" w:cstheme="minorHAnsi"/>
+                <w:b/>
+                <w:bCs/>
+              </w:rPr>
+              <w:t xml:space="preserve"> laboratoire:</w:t>
             </w:r>
           </w:p>
         </w:tc>
@@ -730,17 +1001,47 @@
                 <w:bCs/>
                 <w:color w:val="2F5496" w:themeColor="accent1" w:themeShade="BF"/>
               </w:rPr>
-              <w:t xml:space="preserve"> </w:t>
-            </w:r>
-            <w:r>
-              <w:rPr>
-                <w:rFonts w:asciiTheme="minorHAnsi" w:hAnsiTheme="minorHAnsi" w:cstheme="minorHAnsi"/>
-                <w:b/>
-                <w:bCs/>
-                <w:color w:val="2F5496" w:themeColor="accent1" w:themeShade="BF"/>
-                <w:highlight w:val="yellow"/>
-              </w:rPr>
-              <w:t>11/06/26</w:t>
+              <w:t>{{</w:t>
+            </w:r>
+            <w:proofErr w:type="spellStart"/>
+            <w:r>
+              <w:rPr>
+                <w:rFonts w:asciiTheme="minorHAnsi" w:hAnsiTheme="minorHAnsi" w:cstheme="minorHAnsi"/>
+                <w:b/>
+                <w:bCs/>
+                <w:color w:val="2F5496" w:themeColor="accent1" w:themeShade="BF"/>
+              </w:rPr>
+              <w:t>date_heure_arrive_labo</w:t>
+            </w:r>
+            <w:proofErr w:type="spellEnd"/>
+            <w:r>
+              <w:rPr>
+                <w:rFonts w:asciiTheme="minorHAnsi" w:hAnsiTheme="minorHAnsi" w:cstheme="minorHAnsi"/>
+                <w:b/>
+                <w:bCs/>
+                <w:color w:val="2F5496" w:themeColor="accent1" w:themeShade="BF"/>
+              </w:rPr>
+              <w:t>}} {{</w:t>
+            </w:r>
+            <w:proofErr w:type="spellStart"/>
+            <w:r>
+              <w:rPr>
+                <w:rFonts w:asciiTheme="minorHAnsi" w:hAnsiTheme="minorHAnsi" w:cstheme="minorHAnsi"/>
+                <w:b/>
+                <w:bCs/>
+                <w:color w:val="2F5496" w:themeColor="accent1" w:themeShade="BF"/>
+              </w:rPr>
+              <w:t>temperature_reception</w:t>
+            </w:r>
+            <w:proofErr w:type="spellEnd"/>
+            <w:r>
+              <w:rPr>
+                <w:rFonts w:asciiTheme="minorHAnsi" w:hAnsiTheme="minorHAnsi" w:cstheme="minorHAnsi"/>
+                <w:b/>
+                <w:bCs/>
+                <w:color w:val="2F5496" w:themeColor="accent1" w:themeShade="BF"/>
+              </w:rPr>
+              <w:t>}}</w:t>
             </w:r>
           </w:p>
         </w:tc>
@@ -792,18 +1093,27 @@
               <w:jc w:val="left"/>
               <w:rPr>
                 <w:rFonts w:asciiTheme="minorHAnsi" w:hAnsiTheme="minorHAnsi" w:cstheme="minorHAnsi"/>
-                <w:highlight w:val="yellow"/>
-              </w:rPr>
-            </w:pPr>
-            <w:r>
-              <w:rPr>
-                <w:rFonts w:asciiTheme="minorHAnsi" w:hAnsiTheme="minorHAnsi" w:cstheme="minorHAnsi"/>
-                <w:b/>
-                <w:bCs/>
-                <w:color w:val="2F5496" w:themeColor="accent1" w:themeShade="BF"/>
-                <w:highlight w:val="yellow"/>
-              </w:rPr>
-              <w:t xml:space="preserve"> 11/06/2026 14h</w:t>
+              </w:rPr>
+            </w:pPr>
+            <w:r>
+              <w:rPr>
+                <w:rFonts w:asciiTheme="minorHAnsi" w:hAnsiTheme="minorHAnsi" w:cstheme="minorHAnsi"/>
+              </w:rPr>
+              <w:t xml:space="preserve"> {{</w:t>
+            </w:r>
+            <w:proofErr w:type="spellStart"/>
+            <w:r>
+              <w:rPr>
+                <w:rFonts w:asciiTheme="minorHAnsi" w:hAnsiTheme="minorHAnsi" w:cstheme="minorHAnsi"/>
+              </w:rPr>
+              <w:t>date_heure_mise_en_analyse</w:t>
+            </w:r>
+            <w:proofErr w:type="spellEnd"/>
+            <w:r>
+              <w:rPr>
+                <w:rFonts w:asciiTheme="minorHAnsi" w:hAnsiTheme="minorHAnsi" w:cstheme="minorHAnsi"/>
+              </w:rPr>
+              <w:t>}}</w:t>
             </w:r>
           </w:p>
         </w:tc>
@@ -920,19 +1230,26 @@
                 <w:rFonts w:asciiTheme="minorHAnsi" w:hAnsiTheme="minorHAnsi" w:cstheme="minorHAnsi"/>
                 <w:b/>
                 <w:bCs/>
-                <w:color w:val="2F5496" w:themeColor="accent1" w:themeShade="BF"/>
-              </w:rPr>
-              <w:t xml:space="preserve"> </w:t>
-            </w:r>
-            <w:r>
-              <w:rPr>
-                <w:rFonts w:asciiTheme="minorHAnsi" w:hAnsiTheme="minorHAnsi" w:cstheme="minorHAnsi"/>
-                <w:b/>
-                <w:bCs/>
-                <w:color w:val="2F5496" w:themeColor="accent1" w:themeShade="BF"/>
-                <w:highlight w:val="yellow"/>
-              </w:rPr>
-              <w:t>BPE</w:t>
+              </w:rPr>
+              <w:t xml:space="preserve"> {{</w:t>
+            </w:r>
+            <w:proofErr w:type="spellStart"/>
+            <w:r>
+              <w:rPr>
+                <w:rFonts w:asciiTheme="minorHAnsi" w:hAnsiTheme="minorHAnsi" w:cstheme="minorHAnsi"/>
+                <w:b/>
+                <w:bCs/>
+              </w:rPr>
+              <w:t>fournisseur_fabricant</w:t>
+            </w:r>
+            <w:proofErr w:type="spellEnd"/>
+            <w:r>
+              <w:rPr>
+                <w:rFonts w:asciiTheme="minorHAnsi" w:hAnsiTheme="minorHAnsi" w:cstheme="minorHAnsi"/>
+                <w:b/>
+                <w:bCs/>
+              </w:rPr>
+              <w:t>}}</w:t>
             </w:r>
           </w:p>
         </w:tc>
@@ -986,13 +1303,17 @@
               <w:jc w:val="left"/>
               <w:rPr>
                 <w:rFonts w:asciiTheme="minorHAnsi" w:hAnsiTheme="minorHAnsi" w:cstheme="minorHAnsi"/>
-                <w:color w:val="0070C0"/>
-              </w:rPr>
-            </w:pPr>
-            <w:r>
-              <w:rPr>
-                <w:rFonts w:asciiTheme="minorHAnsi" w:hAnsiTheme="minorHAnsi" w:cstheme="minorHAnsi"/>
-                <w:color w:val="0070C0"/>
+                <w:b/>
+                <w:bCs/>
+                <w:color w:val="2F5496" w:themeColor="accent1" w:themeShade="BF"/>
+              </w:rPr>
+            </w:pPr>
+            <w:r>
+              <w:rPr>
+                <w:rFonts w:asciiTheme="minorHAnsi" w:hAnsiTheme="minorHAnsi" w:cstheme="minorHAnsi"/>
+                <w:b/>
+                <w:bCs/>
+                <w:color w:val="2F5496" w:themeColor="accent1" w:themeShade="BF"/>
               </w:rPr>
               <w:t xml:space="preserve"> </w:t>
             </w:r>
@@ -1002,9 +1323,28 @@
                 <w:b/>
                 <w:bCs/>
                 <w:color w:val="2F5496" w:themeColor="accent1" w:themeShade="BF"/>
-                <w:highlight w:val="yellow"/>
-              </w:rPr>
-              <w:t>frais naturel 3</w:t>
+              </w:rPr>
+              <w:t>{{</w:t>
+            </w:r>
+            <w:proofErr w:type="spellStart"/>
+            <w:r>
+              <w:rPr>
+                <w:rFonts w:asciiTheme="minorHAnsi" w:hAnsiTheme="minorHAnsi" w:cstheme="minorHAnsi"/>
+                <w:b/>
+                <w:bCs/>
+                <w:color w:val="2F5496" w:themeColor="accent1" w:themeShade="BF"/>
+              </w:rPr>
+              <w:t>nom_produit</w:t>
+            </w:r>
+            <w:proofErr w:type="spellEnd"/>
+            <w:r>
+              <w:rPr>
+                <w:rFonts w:asciiTheme="minorHAnsi" w:hAnsiTheme="minorHAnsi" w:cstheme="minorHAnsi"/>
+                <w:b/>
+                <w:bCs/>
+                <w:color w:val="2F5496" w:themeColor="accent1" w:themeShade="BF"/>
+              </w:rPr>
+              <w:t>}}</w:t>
             </w:r>
           </w:p>
         </w:tc>
@@ -1041,8 +1381,18 @@
                 <w:b/>
                 <w:bCs/>
               </w:rPr>
-              <w:t xml:space="preserve"> Conditionnement:</w:t>
-            </w:r>
+              <w:t xml:space="preserve"> </w:t>
+            </w:r>
+            <w:proofErr w:type="gramStart"/>
+            <w:r>
+              <w:rPr>
+                <w:rFonts w:asciiTheme="minorHAnsi" w:hAnsiTheme="minorHAnsi" w:cstheme="minorHAnsi"/>
+                <w:b/>
+                <w:bCs/>
+              </w:rPr>
+              <w:t>Conditionnement:</w:t>
+            </w:r>
+            <w:proofErr w:type="gramEnd"/>
           </w:p>
         </w:tc>
         <w:tc>
@@ -1077,6 +1427,15 @@
               </w:rPr>
               <w:t xml:space="preserve"> </w:t>
             </w:r>
+            <w:r>
+              <w:rPr>
+                <w:rFonts w:asciiTheme="minorHAnsi" w:hAnsiTheme="minorHAnsi" w:cstheme="minorHAnsi"/>
+                <w:b/>
+                <w:bCs/>
+                <w:color w:val="2F5496" w:themeColor="accent1" w:themeShade="BF"/>
+              </w:rPr>
+              <w:t>{{conditionnement}}</w:t>
+            </w:r>
           </w:p>
         </w:tc>
         <w:tc>
@@ -1107,8 +1466,18 @@
                 <w:b/>
                 <w:bCs/>
               </w:rPr>
-              <w:t xml:space="preserve"> Espèce:</w:t>
-            </w:r>
+              <w:t xml:space="preserve"> </w:t>
+            </w:r>
+            <w:proofErr w:type="gramStart"/>
+            <w:r>
+              <w:rPr>
+                <w:rFonts w:asciiTheme="minorHAnsi" w:hAnsiTheme="minorHAnsi" w:cstheme="minorHAnsi"/>
+                <w:b/>
+                <w:bCs/>
+              </w:rPr>
+              <w:t>Espèce:</w:t>
+            </w:r>
+            <w:proofErr w:type="gramEnd"/>
           </w:p>
         </w:tc>
         <w:tc>
@@ -1147,9 +1516,28 @@
                 <w:b/>
                 <w:bCs/>
                 <w:color w:val="2F5496" w:themeColor="accent1" w:themeShade="BF"/>
-                <w:highlight w:val="yellow"/>
-              </w:rPr>
-              <w:t>Thunnus albacares</w:t>
+              </w:rPr>
+              <w:t>{{</w:t>
+            </w:r>
+            <w:proofErr w:type="spellStart"/>
+            <w:r>
+              <w:rPr>
+                <w:rFonts w:asciiTheme="minorHAnsi" w:hAnsiTheme="minorHAnsi" w:cstheme="minorHAnsi"/>
+                <w:b/>
+                <w:bCs/>
+                <w:color w:val="2F5496" w:themeColor="accent1" w:themeShade="BF"/>
+              </w:rPr>
+              <w:t>espece</w:t>
+            </w:r>
+            <w:proofErr w:type="spellEnd"/>
+            <w:r>
+              <w:rPr>
+                <w:rFonts w:asciiTheme="minorHAnsi" w:hAnsiTheme="minorHAnsi" w:cstheme="minorHAnsi"/>
+                <w:b/>
+                <w:bCs/>
+                <w:color w:val="2F5496" w:themeColor="accent1" w:themeShade="BF"/>
+              </w:rPr>
+              <w:t>}}</w:t>
             </w:r>
           </w:p>
         </w:tc>
@@ -1222,6 +1610,35 @@
               </w:rPr>
               <w:t xml:space="preserve"> </w:t>
             </w:r>
+            <w:r>
+              <w:rPr>
+                <w:rFonts w:asciiTheme="minorHAnsi" w:hAnsiTheme="minorHAnsi" w:cstheme="minorHAnsi"/>
+                <w:b/>
+                <w:bCs/>
+                <w:color w:val="2F5496" w:themeColor="accent1" w:themeShade="BF"/>
+              </w:rPr>
+              <w:t>{{</w:t>
+            </w:r>
+            <w:proofErr w:type="spellStart"/>
+            <w:r>
+              <w:rPr>
+                <w:rFonts w:asciiTheme="minorHAnsi" w:hAnsiTheme="minorHAnsi" w:cstheme="minorHAnsi"/>
+                <w:b/>
+                <w:bCs/>
+                <w:color w:val="2F5496" w:themeColor="accent1" w:themeShade="BF"/>
+              </w:rPr>
+              <w:t>agrement</w:t>
+            </w:r>
+            <w:proofErr w:type="spellEnd"/>
+            <w:r>
+              <w:rPr>
+                <w:rFonts w:asciiTheme="minorHAnsi" w:hAnsiTheme="minorHAnsi" w:cstheme="minorHAnsi"/>
+                <w:b/>
+                <w:bCs/>
+                <w:color w:val="2F5496" w:themeColor="accent1" w:themeShade="BF"/>
+              </w:rPr>
+              <w:t>}}</w:t>
+            </w:r>
           </w:p>
         </w:tc>
         <w:tc>
@@ -1252,8 +1669,18 @@
                 <w:b/>
                 <w:bCs/>
               </w:rPr>
-              <w:t xml:space="preserve"> Origine:</w:t>
-            </w:r>
+              <w:t xml:space="preserve"> </w:t>
+            </w:r>
+            <w:proofErr w:type="gramStart"/>
+            <w:r>
+              <w:rPr>
+                <w:rFonts w:asciiTheme="minorHAnsi" w:hAnsiTheme="minorHAnsi" w:cstheme="minorHAnsi"/>
+                <w:b/>
+                <w:bCs/>
+              </w:rPr>
+              <w:t>Origine:</w:t>
+            </w:r>
+            <w:proofErr w:type="gramEnd"/>
           </w:p>
         </w:tc>
         <w:tc>
@@ -1292,9 +1719,8 @@
                 <w:b/>
                 <w:bCs/>
                 <w:color w:val="2F5496" w:themeColor="accent1" w:themeShade="BF"/>
-                <w:highlight w:val="yellow"/>
-              </w:rPr>
-              <w:t>Cote d’ivoire FAO34</w:t>
+              </w:rPr>
+              <w:t>{{origine}}</w:t>
             </w:r>
           </w:p>
         </w:tc>
@@ -1331,8 +1757,18 @@
                 <w:b/>
                 <w:bCs/>
               </w:rPr>
-              <w:t xml:space="preserve"> Lot:</w:t>
-            </w:r>
+              <w:t xml:space="preserve"> </w:t>
+            </w:r>
+            <w:proofErr w:type="gramStart"/>
+            <w:r>
+              <w:rPr>
+                <w:rFonts w:asciiTheme="minorHAnsi" w:hAnsiTheme="minorHAnsi" w:cstheme="minorHAnsi"/>
+                <w:b/>
+                <w:bCs/>
+              </w:rPr>
+              <w:t>Lot:</w:t>
+            </w:r>
+            <w:proofErr w:type="gramEnd"/>
           </w:p>
         </w:tc>
         <w:tc>
@@ -1365,17 +1801,7 @@
                 <w:bCs/>
                 <w:color w:val="2F5496" w:themeColor="accent1" w:themeShade="BF"/>
               </w:rPr>
-              <w:t xml:space="preserve"> </w:t>
-            </w:r>
-            <w:r>
-              <w:rPr>
-                <w:rFonts w:asciiTheme="minorHAnsi" w:hAnsiTheme="minorHAnsi" w:cstheme="minorHAnsi"/>
-                <w:b/>
-                <w:bCs/>
-                <w:color w:val="2F5496" w:themeColor="accent1" w:themeShade="BF"/>
-                <w:highlight w:val="yellow"/>
-              </w:rPr>
-              <w:t>ABP10A 153/ 26</w:t>
+              <w:t xml:space="preserve"> {{lot}}</w:t>
             </w:r>
           </w:p>
         </w:tc>
@@ -1456,9 +1882,28 @@
                 <w:b/>
                 <w:bCs/>
                 <w:color w:val="2F5496" w:themeColor="accent1" w:themeShade="BF"/>
-                <w:highlight w:val="yellow"/>
-              </w:rPr>
-              <w:t>06/06/26</w:t>
+              </w:rPr>
+              <w:t>{{</w:t>
+            </w:r>
+            <w:proofErr w:type="spellStart"/>
+            <w:r>
+              <w:rPr>
+                <w:rFonts w:asciiTheme="minorHAnsi" w:hAnsiTheme="minorHAnsi" w:cstheme="minorHAnsi"/>
+                <w:b/>
+                <w:bCs/>
+                <w:color w:val="2F5496" w:themeColor="accent1" w:themeShade="BF"/>
+              </w:rPr>
+              <w:t>date_emabalage</w:t>
+            </w:r>
+            <w:proofErr w:type="spellEnd"/>
+            <w:r>
+              <w:rPr>
+                <w:rFonts w:asciiTheme="minorHAnsi" w:hAnsiTheme="minorHAnsi" w:cstheme="minorHAnsi"/>
+                <w:b/>
+                <w:bCs/>
+                <w:color w:val="2F5496" w:themeColor="accent1" w:themeShade="BF"/>
+              </w:rPr>
+              <w:t>}}</w:t>
             </w:r>
           </w:p>
         </w:tc>
@@ -1534,9 +1979,28 @@
                 <w:b/>
                 <w:bCs/>
                 <w:color w:val="2F5496" w:themeColor="accent1" w:themeShade="BF"/>
-                <w:highlight w:val="yellow"/>
-              </w:rPr>
-              <w:t>XXX</w:t>
+              </w:rPr>
+              <w:t>{{</w:t>
+            </w:r>
+            <w:proofErr w:type="spellStart"/>
+            <w:r>
+              <w:rPr>
+                <w:rFonts w:asciiTheme="minorHAnsi" w:hAnsiTheme="minorHAnsi" w:cstheme="minorHAnsi"/>
+                <w:b/>
+                <w:bCs/>
+                <w:color w:val="2F5496" w:themeColor="accent1" w:themeShade="BF"/>
+              </w:rPr>
+              <w:t>code_article</w:t>
+            </w:r>
+            <w:proofErr w:type="spellEnd"/>
+            <w:r>
+              <w:rPr>
+                <w:rFonts w:asciiTheme="minorHAnsi" w:hAnsiTheme="minorHAnsi" w:cstheme="minorHAnsi"/>
+                <w:b/>
+                <w:bCs/>
+                <w:color w:val="2F5496" w:themeColor="accent1" w:themeShade="BF"/>
+              </w:rPr>
+              <w:t>}}</w:t>
             </w:r>
           </w:p>
         </w:tc>
@@ -1613,9 +2077,37 @@
                 <w:b/>
                 <w:bCs/>
                 <w:color w:val="2F5496" w:themeColor="accent1" w:themeShade="BF"/>
-                <w:highlight w:val="yellow"/>
-              </w:rPr>
-              <w:t>18/06/26</w:t>
+              </w:rPr>
+              <w:t>{{</w:t>
+            </w:r>
+            <w:proofErr w:type="spellStart"/>
+            <w:r>
+              <w:rPr>
+                <w:rFonts w:asciiTheme="minorHAnsi" w:hAnsiTheme="minorHAnsi" w:cstheme="minorHAnsi"/>
+                <w:b/>
+                <w:bCs/>
+                <w:color w:val="2F5496" w:themeColor="accent1" w:themeShade="BF"/>
+              </w:rPr>
+              <w:t>dlc</w:t>
+            </w:r>
+            <w:proofErr w:type="spellEnd"/>
+            <w:r>
+              <w:rPr>
+                <w:rFonts w:asciiTheme="minorHAnsi" w:hAnsiTheme="minorHAnsi" w:cstheme="minorHAnsi"/>
+                <w:b/>
+                <w:bCs/>
+                <w:color w:val="2F5496" w:themeColor="accent1" w:themeShade="BF"/>
+              </w:rPr>
+              <w:t>}</w:t>
+            </w:r>
+            <w:r>
+              <w:rPr>
+                <w:rFonts w:asciiTheme="minorHAnsi" w:hAnsiTheme="minorHAnsi" w:cstheme="minorHAnsi"/>
+                <w:b/>
+                <w:bCs/>
+                <w:color w:val="2F5496" w:themeColor="accent1" w:themeShade="BF"/>
+              </w:rPr>
+              <w:t>}</w:t>
             </w:r>
           </w:p>
         </w:tc>
@@ -1723,7 +2215,23 @@
                 <w:rFonts w:asciiTheme="minorHAnsi" w:eastAsia="Arial" w:hAnsiTheme="minorHAnsi" w:cstheme="minorHAnsi"/>
                 <w:b/>
               </w:rPr>
-              <w:t>Lot | Date Fab. | DLC</w:t>
+              <w:t xml:space="preserve">Lot | Date </w:t>
+            </w:r>
+            <w:proofErr w:type="spellStart"/>
+            <w:r>
+              <w:rPr>
+                <w:rFonts w:asciiTheme="minorHAnsi" w:eastAsia="Arial" w:hAnsiTheme="minorHAnsi" w:cstheme="minorHAnsi"/>
+                <w:b/>
+              </w:rPr>
+              <w:t>Fab</w:t>
+            </w:r>
+            <w:proofErr w:type="spellEnd"/>
+            <w:r>
+              <w:rPr>
+                <w:rFonts w:asciiTheme="minorHAnsi" w:eastAsia="Arial" w:hAnsiTheme="minorHAnsi" w:cstheme="minorHAnsi"/>
+                <w:b/>
+              </w:rPr>
+              <w:t>. | DLC</w:t>
             </w:r>
           </w:p>
         </w:tc>
@@ -1917,9 +2425,28 @@
                 <w:b/>
                 <w:bCs/>
                 <w:color w:val="2F5496" w:themeColor="accent1" w:themeShade="BF"/>
-                <w:highlight w:val="yellow"/>
-              </w:rPr>
-              <w:t>Lot PRECICE 230426</w:t>
+              </w:rPr>
+              <w:t>Lot PRECICE {{</w:t>
+            </w:r>
+            <w:proofErr w:type="spellStart"/>
+            <w:r>
+              <w:rPr>
+                <w:rFonts w:asciiTheme="minorHAnsi" w:hAnsiTheme="minorHAnsi" w:cstheme="minorHAnsi"/>
+                <w:b/>
+                <w:bCs/>
+                <w:color w:val="2F5496" w:themeColor="accent1" w:themeShade="BF"/>
+              </w:rPr>
+              <w:t>lot_precice</w:t>
+            </w:r>
+            <w:proofErr w:type="spellEnd"/>
+            <w:r>
+              <w:rPr>
+                <w:rFonts w:asciiTheme="minorHAnsi" w:hAnsiTheme="minorHAnsi" w:cstheme="minorHAnsi"/>
+                <w:b/>
+                <w:bCs/>
+                <w:color w:val="2F5496" w:themeColor="accent1" w:themeShade="BF"/>
+              </w:rPr>
+              <w:t>}}</w:t>
             </w:r>
           </w:p>
         </w:tc>
@@ -1982,19 +2509,48 @@
                 <w:b/>
                 <w:bCs/>
                 <w:color w:val="2F5496" w:themeColor="accent1" w:themeShade="BF"/>
-                <w:highlight w:val="yellow"/>
-              </w:rPr>
-            </w:pPr>
-            <w:r>
-              <w:rPr>
-                <w:rFonts w:asciiTheme="minorHAnsi" w:hAnsiTheme="minorHAnsi" w:cstheme="minorHAnsi"/>
-                <w:b/>
-                <w:bCs/>
-                <w:color w:val="2F5496" w:themeColor="accent1" w:themeShade="BF"/>
-                <w:highlight w:val="yellow"/>
-              </w:rPr>
-              <w:t>IMP 58%</w:t>
-            </w:r>
+              </w:rPr>
+            </w:pPr>
+            <w:r>
+              <w:rPr>
+                <w:rFonts w:asciiTheme="minorHAnsi" w:hAnsiTheme="minorHAnsi" w:cstheme="minorHAnsi"/>
+                <w:b/>
+                <w:bCs/>
+                <w:color w:val="2F5496" w:themeColor="accent1" w:themeShade="BF"/>
+              </w:rPr>
+              <w:t>IMP</w:t>
+            </w:r>
+            <w:r>
+              <w:rPr>
+                <w:rFonts w:asciiTheme="minorHAnsi" w:hAnsiTheme="minorHAnsi" w:cstheme="minorHAnsi"/>
+                <w:b/>
+                <w:bCs/>
+                <w:color w:val="2F5496" w:themeColor="accent1" w:themeShade="BF"/>
+              </w:rPr>
+              <w:t xml:space="preserve"> {{</w:t>
+            </w:r>
+            <w:proofErr w:type="spellStart"/>
+            <w:r>
+              <w:rPr>
+                <w:rFonts w:asciiTheme="minorHAnsi" w:hAnsiTheme="minorHAnsi" w:cstheme="minorHAnsi"/>
+                <w:b/>
+                <w:bCs/>
+                <w:color w:val="2F5496" w:themeColor="accent1" w:themeShade="BF"/>
+              </w:rPr>
+              <w:t>imp</w:t>
+            </w:r>
+            <w:proofErr w:type="spellEnd"/>
+            <w:proofErr w:type="gramStart"/>
+            <w:r>
+              <w:rPr>
+                <w:rFonts w:asciiTheme="minorHAnsi" w:hAnsiTheme="minorHAnsi" w:cstheme="minorHAnsi"/>
+                <w:b/>
+                <w:bCs/>
+                <w:color w:val="2F5496" w:themeColor="accent1" w:themeShade="BF"/>
+              </w:rPr>
+              <w:t>}}%</w:t>
+            </w:r>
+            <w:proofErr w:type="gramEnd"/>
           </w:p>
           <w:p>
             <w:pPr>
@@ -2014,9 +2570,37 @@
                 <w:b/>
                 <w:bCs/>
                 <w:color w:val="2F5496" w:themeColor="accent1" w:themeShade="BF"/>
-                <w:highlight w:val="yellow"/>
-              </w:rPr>
-              <w:t>K-value 42%</w:t>
+              </w:rPr>
+              <w:t xml:space="preserve">K-value </w:t>
+            </w:r>
+            <w:r>
+              <w:rPr>
+                <w:rFonts w:asciiTheme="minorHAnsi" w:hAnsiTheme="minorHAnsi" w:cstheme="minorHAnsi"/>
+                <w:b/>
+                <w:bCs/>
+                <w:color w:val="2F5496" w:themeColor="accent1" w:themeShade="BF"/>
+              </w:rPr>
+              <w:t>{{</w:t>
+            </w:r>
+            <w:proofErr w:type="spellStart"/>
+            <w:r>
+              <w:rPr>
+                <w:rFonts w:asciiTheme="minorHAnsi" w:hAnsiTheme="minorHAnsi" w:cstheme="minorHAnsi"/>
+                <w:b/>
+                <w:bCs/>
+                <w:color w:val="2F5496" w:themeColor="accent1" w:themeShade="BF"/>
+              </w:rPr>
+              <w:t>k_value</w:t>
+            </w:r>
+            <w:proofErr w:type="spellEnd"/>
+            <w:r>
+              <w:rPr>
+                <w:rFonts w:asciiTheme="minorHAnsi" w:hAnsiTheme="minorHAnsi" w:cstheme="minorHAnsi"/>
+                <w:b/>
+                <w:bCs/>
+                <w:color w:val="2F5496" w:themeColor="accent1" w:themeShade="BF"/>
+              </w:rPr>
+              <w:t>}}</w:t>
             </w:r>
           </w:p>
         </w:tc>
@@ -2040,11 +2624,19 @@
                 <w:rFonts w:asciiTheme="minorHAnsi" w:hAnsiTheme="minorHAnsi" w:cstheme="minorHAnsi"/>
               </w:rPr>
             </w:pPr>
-            <w:r>
-              <w:rPr>
-                <w:rFonts w:asciiTheme="minorHAnsi" w:hAnsiTheme="minorHAnsi" w:cstheme="minorHAnsi"/>
-              </w:rPr>
-              <w:t>Molar %</w:t>
+            <w:proofErr w:type="spellStart"/>
+            <w:r>
+              <w:rPr>
+                <w:rFonts w:asciiTheme="minorHAnsi" w:hAnsiTheme="minorHAnsi" w:cstheme="minorHAnsi"/>
+              </w:rPr>
+              <w:t>Molar</w:t>
+            </w:r>
+            <w:proofErr w:type="spellEnd"/>
+            <w:r>
+              <w:rPr>
+                <w:rFonts w:asciiTheme="minorHAnsi" w:hAnsiTheme="minorHAnsi" w:cstheme="minorHAnsi"/>
+              </w:rPr>
+              <w:t xml:space="preserve"> %</w:t>
             </w:r>
           </w:p>
         </w:tc>
@@ -2070,13 +2662,23 @@
                 <w:lang w:val="en-US"/>
               </w:rPr>
             </w:pPr>
+            <w:proofErr w:type="gramStart"/>
             <w:r>
               <w:rPr>
                 <w:rFonts w:asciiTheme="minorHAnsi" w:hAnsiTheme="minorHAnsi" w:cstheme="minorHAnsi"/>
                 <w:szCs w:val="12"/>
                 <w:lang w:val="en-US"/>
               </w:rPr>
-              <w:t>Sashimi : IMP &gt;90% /K-value &lt;10%</w:t>
+              <w:t>Sashimi :</w:t>
+            </w:r>
+            <w:proofErr w:type="gramEnd"/>
+            <w:r>
+              <w:rPr>
+                <w:rFonts w:asciiTheme="minorHAnsi" w:hAnsiTheme="minorHAnsi" w:cstheme="minorHAnsi"/>
+                <w:szCs w:val="12"/>
+                <w:lang w:val="en-US"/>
+              </w:rPr>
+              <w:t xml:space="preserve"> IMP &gt;90% /K-value &lt;10%</w:t>
             </w:r>
           </w:p>
           <w:p>
@@ -2090,13 +2692,23 @@
                 <w:lang w:val="en-US"/>
               </w:rPr>
             </w:pPr>
+            <w:proofErr w:type="gramStart"/>
             <w:r>
               <w:rPr>
                 <w:rFonts w:asciiTheme="minorHAnsi" w:hAnsiTheme="minorHAnsi" w:cstheme="minorHAnsi"/>
                 <w:szCs w:val="12"/>
                 <w:lang w:val="en-US"/>
               </w:rPr>
-              <w:t>Extra : IMP 65-90%  K-value 10-35%</w:t>
+              <w:t>Extra :</w:t>
+            </w:r>
+            <w:proofErr w:type="gramEnd"/>
+            <w:r>
+              <w:rPr>
+                <w:rFonts w:asciiTheme="minorHAnsi" w:hAnsiTheme="minorHAnsi" w:cstheme="minorHAnsi"/>
+                <w:szCs w:val="12"/>
+                <w:lang w:val="en-US"/>
+              </w:rPr>
+              <w:t xml:space="preserve"> IMP 65-90%  K-value 10-35%</w:t>
             </w:r>
           </w:p>
           <w:p>
@@ -2320,7 +2932,7 @@
           </mc:Choice>
           <mc:Fallback>
             <w:pict>
-              <v:rect w14:anchorId="741B0683" id="Rectangle 116" o:spid="_x0000_s1026" style="position:absolute;left:0;text-align:left;margin-left:0;margin-top:1.35pt;width:52.15pt;height:9.5pt;z-index:251666432;visibility:visible;mso-wrap-style:square;mso-wrap-distance-left:9pt;mso-wrap-distance-top:0;mso-wrap-distance-right:9pt;mso-wrap-distance-bottom:0;mso-position-horizontal:absolute;mso-position-horizontal-relative:text;mso-position-vertical:absolute;mso-position-vertical-relative:text;v-text-anchor:top" o:gfxdata="UEsDBBQABgAIAAAAIQC2gziS/gAAAOEBAAATAAAAW0NvbnRlbnRfVHlwZXNdLnhtbJSRQU7DMBBF 90jcwfIWJU67QAgl6YK0S0CoHGBkTxKLZGx5TGhvj5O2G0SRWNoz/78nu9wcxkFMGNg6quQqL6RA 0s5Y6ir5vt9lD1JwBDIwOMJKHpHlpr69KfdHjyxSmriSfYz+USnWPY7AufNIadK6MEJMx9ApD/oD OlTrorhX2lFEilmcO2RdNtjC5xDF9pCuTyYBB5bi6bQ4syoJ3g9WQ0ymaiLzg5KdCXlKLjvcW893 SUOqXwnz5DrgnHtJTxOsQfEKIT7DmDSUCaxw7Rqn8787ZsmRM9e2VmPeBN4uqYvTtW7jvijg9N/y JsXecLq0q+WD6m8AAAD//wMAUEsDBBQABgAIAAAAIQA4/SH/1gAAAJQBAAALAAAAX3JlbHMvLnJl bHOkkMFqwzAMhu+DvYPRfXGawxijTi+j0GvpHsDYimMaW0Yy2fr2M4PBMnrbUb/Q94l/f/hMi1qR JVI2sOt6UJgd+ZiDgffL8ekFlFSbvV0oo4EbChzGx4f9GRdb25HMsYhqlCwG5lrLq9biZkxWOiqY 22YiTra2kYMu1l1tQD30/bPm3wwYN0x18gb45AdQl1tp5j/sFB2T0FQ7R0nTNEV3j6o9feQzro1i OWA14Fm+Q8a1a8+Bvu/d/dMb2JY5uiPbhG/ktn4cqGU/er3pcvwCAAD//wMAUEsDBBQABgAIAAAA IQBQYeuklAEAACUDAAAOAAAAZHJzL2Uyb0RvYy54bWysUsFu2zAMvQ/oPwi6N3ICLOuMOEWxosOA YS3Q9gMUWYoFyKJAqbGzrx8lO8nQ3YZe6CeSJh8fubkde8cOGqMF3/DlouJMewWt9fuGv748XN9w FpP0rXTgdcOPOvLb7dWnzRBqvYIOXKuRUREf6yE0vEsp1EJE1elexgUE7SloAHuZ6Il70aIcqHrv xKqq1mIAbAOC0jGS934K8m2pb4xW6dGYqBNzDSduqVgsdpet2G5kvUcZOqtmGvI/WPTSemp6LnUv k2RvaP8p1VuFEMGkhYJegDFW6TIDTbOs3k3z3MmgyywkTgxnmeLHlVW/Ds/hCUmGIcQ6EsxTjAb7 /CV+bCxiHc9i6TExRc71evX5hiRVFFquqq/LL1lMcfk5YEzfNfQsg4Yj7aJIJA8/Y5pSTym5l/PZ eniwzk3R7BEXWhmlcTfOXHfQHp+QdYC/H+kAjYOh4TAjnm+SmuYoZ+6HJ8ny+k8AT2B3ApjcNyhH MtG4e0tgbOGZG0/dZj60izLpfDd52X+/S9blurd/AAAA//8DAFBLAwQUAAYACAAAACEAKrXhrdwA AAAFAQAADwAAAGRycy9kb3ducmV2LnhtbEyPzW7CMBCE75V4B2sr9VYcaFUgjYNQf0SPBSrR3ky8 TSLsdRQvJPD0NadyHM1o5pts3jsrjtiG2pOC0TABgVR4U1Op4Gvzfj8FEViT0dYTKjhhgHk+uMl0 anxHKzyuuRSxhEKqFVTMTSplKCp0Ogx9gxS9X986zVG2pTSt7mK5s3KcJE/S6ZriQqUbfKmw2K8P TsFy2iy+P/y5K+3bz3L7uZ29bmas1N1tv3gGwdjzfxgu+BEd8si08wcyQVgF8QgrGE9AXMzk8QHE LurRBGSeyWv6/A8AAP//AwBQSwECLQAUAAYACAAAACEAtoM4kv4AAADhAQAAEwAAAAAAAAAAAAAA AAAAAAAAW0NvbnRlbnRfVHlwZXNdLnhtbFBLAQItABQABgAIAAAAIQA4/SH/1gAAAJQBAAALAAAA AAAAAAAAAAAAAC8BAABfcmVscy8ucmVsc1BLAQItABQABgAIAAAAIQBQYeuklAEAACUDAAAOAAAA AAAAAAAAAAAAAC4CAABkcnMvZTJvRG9jLnhtbFBLAQItABQABgAIAAAAIQAqteGt3AAAAAUBAAAP AAAAAAAAAAAAAAAAAO4DAABkcnMvZG93bnJldi54bWxQSwUGAAAAAAQABADzAAAA9wQAAAAA " filled="f" stroked="f">
+              <v:rect w14:anchorId="741B0683" id="Rectangle 116" o:spid="_x0000_s1026" style="position:absolute;left:0;text-align:left;margin-left:0;margin-top:1.35pt;width:52.15pt;height:9.5pt;z-index:251666432;visibility:visible;mso-wrap-style:square;mso-wrap-distance-left:9pt;mso-wrap-distance-top:0;mso-wrap-distance-right:9pt;mso-wrap-distance-bottom:0;mso-position-horizontal:absolute;mso-position-horizontal-relative:text;mso-position-vertical:absolute;mso-position-vertical-relative:text;v-text-anchor:top" o:gfxdata="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" filled="f" stroked="f">
                 <v:textbox inset="0,0,0,0">
                   <w:txbxContent>
                     <w:p>
@@ -2356,16 +2968,33 @@
         </w:rPr>
       </w:pPr>
       <w:r>
-        <w:t xml:space="preserve">Résultat(s) : </w:t>
+        <w:t>Résultat(s) :</w:t>
       </w:r>
       <w:r>
         <w:rPr>
           <w:b/>
           <w:bCs/>
           <w:color w:val="2F5496" w:themeColor="accent1" w:themeShade="BF"/>
-          <w:highlight w:val="yellow"/>
-        </w:rPr>
-        <w:t>conforme(s) au(x) critère(s).</w:t>
+        </w:rPr>
+        <w:t xml:space="preserve"> {{</w:t>
+      </w:r>
+      <w:proofErr w:type="spellStart"/>
+      <w:r>
+        <w:rPr>
+          <w:b/>
+          <w:bCs/>
+          <w:color w:val="2F5496" w:themeColor="accent1" w:themeShade="BF"/>
+        </w:rPr>
+        <w:t>conformite</w:t>
+      </w:r>
+      <w:proofErr w:type="spellEnd"/>
+      <w:r>
+        <w:rPr>
+          <w:b/>
+          <w:bCs/>
+          <w:color w:val="2F5496" w:themeColor="accent1" w:themeShade="BF"/>
+        </w:rPr>
+        <w:t>}}</w:t>
       </w:r>
     </w:p>
     <w:p>
@@ -2382,20 +3011,24 @@
       <w:r>
         <w:t>Qualité </w:t>
       </w:r>
-      <w:r>
-        <w:rPr>
-          <w:highlight w:val="yellow"/>
-        </w:rPr>
-        <w:t xml:space="preserve">:  </w:t>
-      </w:r>
-      <w:r>
-        <w:rPr>
-          <w:b/>
-          <w:bCs/>
-          <w:color w:val="2F5496" w:themeColor="accent1" w:themeShade="BF"/>
-          <w:highlight w:val="yellow"/>
-        </w:rPr>
-        <w:t>A</w:t>
+      <w:proofErr w:type="gramStart"/>
+      <w:r>
+        <w:t xml:space="preserve">: </w:t>
+      </w:r>
+      <w:r>
+        <w:t xml:space="preserve"> {</w:t>
+      </w:r>
+      <w:proofErr w:type="gramEnd"/>
+      <w:r>
+        <w:t>{</w:t>
+      </w:r>
+      <w:proofErr w:type="spellStart"/>
+      <w:r>
+        <w:t>qualite</w:t>
+      </w:r>
+      <w:proofErr w:type="spellEnd"/>
+      <w:r>
+        <w:t>}}</w:t>
       </w:r>
     </w:p>
     <w:p>
@@ -2479,7 +3112,11 @@
       </w:r>
       <w:r>
         <w:t>Boulogne sur Mer, le</w:t>
+      </w:r>
+      <w:r>
         <w:tab/>
+      </w:r>
+      <w:r>
         <w:tab/>
       </w:r>
     </w:p>
@@ -2496,8 +3133,52 @@
         <w:rPr>
           <w:szCs w:val="16"/>
         </w:rPr>
-        <w:t>21/06/2026</w:t>
+        <w:t>{{</w:t>
+      </w:r>
+      <w:proofErr w:type="spellStart"/>
+      <w:r>
+        <w:rPr>
+          <w:szCs w:val="16"/>
+        </w:rPr>
+        <w:t>date_du_</w:t>
+      </w:r>
+      <w:proofErr w:type="gramStart"/>
+      <w:r>
+        <w:rPr>
+          <w:szCs w:val="16"/>
+        </w:rPr>
+        <w:t>jour</w:t>
+      </w:r>
+      <w:proofErr w:type="spellEnd"/>
+      <w:r>
+        <w:rPr>
+          <w:szCs w:val="16"/>
+        </w:rPr>
+        <w:t xml:space="preserve"> </w:t>
+      </w:r>
+      <w:r>
+        <w:rPr>
+          <w:szCs w:val="16"/>
+        </w:rPr>
+        <w:t>}</w:t>
+      </w:r>
+      <w:proofErr w:type="gramEnd"/>
+      <w:r>
+        <w:rPr>
+          <w:szCs w:val="16"/>
+        </w:rPr>
+        <w:t>}</w:t>
+      </w:r>
+      <w:r>
+        <w:rPr>
+          <w:szCs w:val="16"/>
+        </w:rPr>
         <w:tab/>
+      </w:r>
+      <w:r>
+        <w:rPr>
+          <w:szCs w:val="16"/>
+        </w:rPr>
         <w:tab/>
       </w:r>
     </w:p>
@@ -2516,6 +3197,8 @@
       </w:pPr>
       <w:r>
         <w:t>BALAKIREVA Larissa, PhD</w:t>
+      </w:r>
+      <w:r>
         <w:tab/>
       </w:r>
     </w:p>
@@ -2527,6 +3210,8 @@
       </w:pPr>
       <w:r>
         <w:t>Responsable de laboratoire</w:t>
+      </w:r>
+      <w:r>
         <w:tab/>
       </w:r>
     </w:p>

</xml_diff>